<commit_message>
Align HR with internal payroll service
</commit_message>
<xml_diff>
--- a/docs/training/Anata-HR-Operator-Training-Guide.docx
+++ b/docs/training/Anata-HR-Operator-Training-Guide.docx
@@ -1981,7 +1981,7 @@
         <w:ind w:left="259"/>
       </w:pPr>
       <w:r>
-        <w:t>Until a full-service payroll provider is selected, fill and deliver paper checks using the approved amounts. Confirm each check number and issuance in the run. Do not describe an Anata estimate as provider-authoritative payroll.</w:t>
+        <w:t>Until an authoritative payroll service is connected, fill and deliver paper checks using the approved amounts. Confirm each check number and issuance in the run. Do not describe an Anata estimate as authoritative payroll.</w:t>
       </w:r>
     </w:p>
     <w:p>
@@ -2213,7 +2213,7 @@
         <w:pStyle w:val="Heading1"/>
       </w:pPr>
       <w:r>
-        <w:t>9. Outside payroll-provider handoff</w:t>
+        <w:t>9. Authoritative payroll-service handoff</w:t>
       </w:r>
     </w:p>
     <w:p>
@@ -2235,13 +2235,13 @@
         <w:pStyle w:val="Heading2"/>
       </w:pPr>
       <w:r>
-        <w:t>2. Enter payroll in the outside provider</w:t>
+        <w:t>2. Send payroll to the connected service</w:t>
       </w:r>
     </w:p>
     <w:p>
       <w:pPr/>
       <w:r>
-        <w:t>The outside provider must perform the legally authoritative wage calculation, tax withholding/deposit/filing, and direct deposit when that service is connected.</w:t>
+        <w:t>The connected service is authoritative only for the capabilities it explicitly declares and proves, such as final wage calculation, tax withholding/deposit/filing, or distribution.</w:t>
       </w:r>
     </w:p>
     <w:p>
@@ -2249,13 +2249,13 @@
         <w:pStyle w:val="Heading2"/>
       </w:pPr>
       <w:r>
-        <w:t>3. Record the provider run</w:t>
+        <w:t>3. Record the service run</w:t>
       </w:r>
     </w:p>
     <w:p>
       <w:pPr/>
       <w:r>
-        <w:t>Enter the provider name, provider run/reference, and an evidence note. Recording submission does not mean payroll has been paid or taxes have been filed.</w:t>
+        <w:t>Enter the service name, run/reference, and an evidence note. Recording a handoff does not mean payroll has been paid or taxes have been filed.</w:t>
       </w:r>
     </w:p>
     <w:p>
@@ -2269,7 +2269,7 @@
     <w:p>
       <w:pPr/>
       <w:r>
-        <w:t>Enter the provider’s final gross, net, total taxes, and employer cost. Anata marks an exact match or lists each variance. Investigate every variance before relying on the outside result.</w:t>
+        <w:t>Enter the service’s confirmed gross, net, total taxes, and employer cost. Anata marks an exact match or lists each variance. Investigate every variance before relying on the result.</w:t>
       </w:r>
     </w:p>
     <w:p>
@@ -2283,7 +2283,7 @@
     <w:p>
       <w:pPr/>
       <w:r>
-        <w:t>Keep the final provider report and confirmation under Anata’s secure records policy. Anata keeps the reference and comparison audit; the provider remains the authority for its filings and transfers.</w:t>
+        <w:t>Keep the final service report and confirmation under Anata’s secure records policy. Anata keeps the reference and comparison audit; the connected service is authoritative only for the capabilities it owns.</w:t>
       </w:r>
     </w:p>
     <w:p>
@@ -3317,7 +3317,7 @@
         <w:pStyle w:val="ListBullet"/>
       </w:pPr>
       <w:r>
-        <w:t>Outside provider reference and final-total comparison recorded when a provider is used.</w:t>
+        <w:t>Payroll-service reference and final-total comparison recorded when a service is used.</w:t>
       </w:r>
     </w:p>
     <w:p>

</xml_diff>

<commit_message>
Add guarded Base44 HR history recovery
</commit_message>
<xml_diff>
--- a/docs/training/Anata-HR-Operator-Training-Guide.docx
+++ b/docs/training/Anata-HR-Operator-Training-Guide.docx
@@ -2207,6 +2207,44 @@
       <w:pPr>
         <w:spacing w:after="20"/>
       </w:pPr>
+    </w:p>
+    <w:p>
+      <w:pPr>
+        <w:pStyle w:val="Heading2"/>
+      </w:pPr>
+      <w:r>
+        <w:t>Recover the Base44 history</w:t>
+      </w:r>
+    </w:p>
+    <w:p>
+      <w:pPr/>
+      <w:r>
+        <w:t>Open HR → Settings → Recover the history you already exported. Select the original “HR data table export” ZIP and review the preview before importing anything.</w:t>
+      </w:r>
+    </w:p>
+    <w:p>
+      <w:pPr/>
+      <w:r>
+        <w:t>The preview shows the people, time entries, payroll history, issued checks, excluded sample rows, and a unique archive fingerprint. It does not write records.</w:t>
+      </w:r>
+    </w:p>
+    <w:p>
+      <w:pPr/>
+      <w:r>
+        <w:t>If the preview is correct, select the same ZIP again, confirm the review statement, and import. The matching fingerprint prevents a different file from being substituted after review.</w:t>
+      </w:r>
+    </w:p>
+    <w:p>
+      <w:pPr/>
+      <w:r>
+        <w:t>Recovered people remain inactive until David or Val reviews their current employment type and compensation. Historical Base44 tax settings are never activated. Opening balances are draft candidates based on issued-check evidence and still require independent approval.</w:t>
+      </w:r>
+    </w:p>
+    <w:p>
+      <w:pPr/>
+      <w:r>
+        <w:t>The import is idempotent: uploading the same export again skips records already recovered. It never sends invitations, stores full SSNs or bank details, files taxes, or moves money.</w:t>
+      </w:r>
     </w:p>
     <w:p>
       <w:pPr>

</xml_diff>

<commit_message>
Complete PTO calendar controls and training
</commit_message>
<xml_diff>
--- a/docs/training/Anata-HR-Operator-Training-Guide.docx
+++ b/docs/training/Anata-HR-Operator-Training-Guide.docx
@@ -1591,7 +1591,39 @@
         <w:ind w:left="259"/>
       </w:pPr>
       <w:r>
-        <w:t>The requester cannot approve their own request. The decision posts to the PTO record and later payroll treatment.</w:t>
+        <w:t>The requester cannot approve their own request. The assigned manager receives a privacy-safe email that links back to the authenticated Time &amp; PTO page; the email itself cannot approve anything. Approval reserves the PTO balance and adds an all-day event to the dedicated Anata OOO calendar. Denial creates no calendar event. The employee receives the decision by email.</w:t>
+      </w:r>
+    </w:p>
+    <w:p>
+      <w:pPr>
+        <w:pStyle w:val="Heading2"/>
+      </w:pPr>
+      <w:r>
+        <w:t>OOO calendar setup, revocation, and recovery</w:t>
+      </w:r>
+    </w:p>
+    <w:p>
+      <w:pPr/>
+      <w:r>
+        <w:t>Open HR → Settings → Time-off calendar. A Ready status means the dedicated calendar ID and service account are configured. Never paste the service-account JSON into an HR form or email; it belongs only in Render’s secret environment settings.</w:t>
+      </w:r>
+    </w:p>
+    <w:p>
+      <w:pPr/>
+      <w:r>
+        <w:t>If a pending request says the manager email needs attention, use Resend manager email. The reviewer still signs in to approve or deny; email never grants approval authority.</w:t>
+      </w:r>
+    </w:p>
+    <w:p>
+      <w:pPr/>
+      <w:r>
+        <w:t>If approved time must be canceled, an authorized reviewer enters a revocation reason and selects Revoke approved PTO. Anata preserves the approval history, releases the reserved hours, removes the OOO event, and emails the employee.</w:t>
+      </w:r>
+    </w:p>
+    <w:p>
+      <w:pPr/>
+      <w:r>
+        <w:t>If Google is unavailable, the PTO decision remains valid and the row shows that calendar attention is needed. After restoring the connection, select Retry OOO calendar. Do not edit the Google event manually as a substitute for the HR record.</w:t>
       </w:r>
     </w:p>
     <w:p>

</xml_diff>